<commit_message>
Ajuste menor de colores
Inclute código de colores para Word del azul
</commit_message>
<xml_diff>
--- a/Logos/GUÍA DE USO.docx
+++ b/Logos/GUÍA DE USO.docx
@@ -1,6 +1,6 @@
 
 <file path=word/document.xml><?xml version="1.0" encoding="utf-8"?>
-<w:document xmlns:wpc="http://schemas.microsoft.com/office/word/2010/wordprocessingCanvas" xmlns:cx="http://schemas.microsoft.com/office/drawing/2014/chartex" xmlns:cx1="http://schemas.microsoft.com/office/drawing/2015/9/8/chartex" xmlns:cx2="http://schemas.microsoft.com/office/drawing/2015/10/21/chartex" xmlns:cx3="http://schemas.microsoft.com/office/drawing/2016/5/9/chartex" xmlns:cx4="http://schemas.microsoft.com/office/drawing/2016/5/10/chartex" xmlns:cx5="http://schemas.microsoft.com/office/drawing/2016/5/11/chartex" xmlns:cx6="http://schemas.microsoft.com/office/drawing/2016/5/12/chartex" xmlns:cx7="http://schemas.microsoft.com/office/drawing/2016/5/13/chartex" xmlns:cx8="http://schemas.microsoft.com/office/drawing/2016/5/14/chartex" xmlns:mc="http://schemas.openxmlformats.org/markup-compatibility/2006" xmlns:aink="http://schemas.microsoft.com/office/drawing/2016/ink" xmlns:am3d="http://schemas.microsoft.com/office/drawing/2017/model3d" xmlns:o="urn:schemas-microsoft-com:office:office" xmlns:oel="http://schemas.microsoft.com/office/2019/extlst" xmlns:r="http://schemas.openxmlformats.org/officeDocument/2006/relationships" xmlns:m="http://schemas.openxmlformats.org/officeDocument/2006/math" xmlns:v="urn:schemas-microsoft-com:vml" xmlns:wp14="http://schemas.microsoft.com/office/word/2010/wordprocessingDrawing" xmlns:wp="http://schemas.openxmlformats.org/drawingml/2006/wordprocessingDrawing" xmlns:w10="urn:schemas-microsoft-com:office:word" xmlns:w="http://schemas.openxmlformats.org/wordprocessingml/2006/main" xmlns:w14="http://schemas.microsoft.com/office/word/2010/wordml" xmlns:w15="http://schemas.microsoft.com/office/word/2012/wordml" xmlns:w16cex="http://schemas.microsoft.com/office/word/2018/wordml/cex" xmlns:w16cid="http://schemas.microsoft.com/office/word/2016/wordml/cid" xmlns:w16="http://schemas.microsoft.com/office/word/2018/wordml" xmlns:w16sdtdh="http://schemas.microsoft.com/office/word/2020/wordml/sdtdatahash" xmlns:w16se="http://schemas.microsoft.com/office/word/2015/wordml/symex" xmlns:wpg="http://schemas.microsoft.com/office/word/2010/wordprocessingGroup" xmlns:wpi="http://schemas.microsoft.com/office/word/2010/wordprocessingInk" xmlns:wne="http://schemas.microsoft.com/office/word/2006/wordml" xmlns:wps="http://schemas.microsoft.com/office/word/2010/wordprocessingShape" mc:Ignorable="w14 w15 w16se w16cid w16 w16cex w16sdtdh wp14">
+<w:document xmlns:wpc="http://schemas.microsoft.com/office/word/2010/wordprocessingCanvas" xmlns:cx="http://schemas.microsoft.com/office/drawing/2014/chartex" xmlns:cx1="http://schemas.microsoft.com/office/drawing/2015/9/8/chartex" xmlns:cx2="http://schemas.microsoft.com/office/drawing/2015/10/21/chartex" xmlns:cx3="http://schemas.microsoft.com/office/drawing/2016/5/9/chartex" xmlns:cx4="http://schemas.microsoft.com/office/drawing/2016/5/10/chartex" xmlns:cx5="http://schemas.microsoft.com/office/drawing/2016/5/11/chartex" xmlns:cx6="http://schemas.microsoft.com/office/drawing/2016/5/12/chartex" xmlns:cx7="http://schemas.microsoft.com/office/drawing/2016/5/13/chartex" xmlns:cx8="http://schemas.microsoft.com/office/drawing/2016/5/14/chartex" xmlns:mc="http://schemas.openxmlformats.org/markup-compatibility/2006" xmlns:aink="http://schemas.microsoft.com/office/drawing/2016/ink" xmlns:am3d="http://schemas.microsoft.com/office/drawing/2017/model3d" xmlns:o="urn:schemas-microsoft-com:office:office" xmlns:oel="http://schemas.microsoft.com/office/2019/extlst" xmlns:r="http://schemas.openxmlformats.org/officeDocument/2006/relationships" xmlns:m="http://schemas.openxmlformats.org/officeDocument/2006/math" xmlns:v="urn:schemas-microsoft-com:vml" xmlns:wp14="http://schemas.microsoft.com/office/word/2010/wordprocessingDrawing" xmlns:wp="http://schemas.openxmlformats.org/drawingml/2006/wordprocessingDrawing" xmlns:w10="urn:schemas-microsoft-com:office:word" xmlns:w="http://schemas.openxmlformats.org/wordprocessingml/2006/main" xmlns:w14="http://schemas.microsoft.com/office/word/2010/wordml" xmlns:w15="http://schemas.microsoft.com/office/word/2012/wordml" xmlns:w16cex="http://schemas.microsoft.com/office/word/2018/wordml/cex" xmlns:w16cid="http://schemas.microsoft.com/office/word/2016/wordml/cid" xmlns:w16="http://schemas.microsoft.com/office/word/2018/wordml" xmlns:w16du="http://schemas.microsoft.com/office/word/2023/wordml/word16du" xmlns:w16sdtdh="http://schemas.microsoft.com/office/word/2020/wordml/sdtdatahash" xmlns:w16sdtfl="http://schemas.microsoft.com/office/word/2024/wordml/sdtformatlock" xmlns:w16se="http://schemas.microsoft.com/office/word/2015/wordml/symex" xmlns:wpg="http://schemas.microsoft.com/office/word/2010/wordprocessingGroup" xmlns:wpi="http://schemas.microsoft.com/office/word/2010/wordprocessingInk" xmlns:wne="http://schemas.microsoft.com/office/word/2006/wordml" xmlns:wps="http://schemas.microsoft.com/office/word/2010/wordprocessingShape" mc:Ignorable="w14 w15 w16se w16cid w16 w16cex w16sdtdh w16sdtfl w16du wp14">
   <w:body>
     <w:p>
       <w:pPr>
@@ -16,8 +16,6 @@
       </w:r>
       <w:r>
         <w:br/>
-      </w:r>
-      <w:r>
         <w:t>Nuevo Logo de la Facultad de Ingeniería de la Universidad de Concepción</w:t>
       </w:r>
     </w:p>
@@ -109,7 +107,7 @@
     </w:p>
     <w:tbl>
       <w:tblPr>
-        <w:tblStyle w:val="Tablaconcuadrcula"/>
+        <w:tblStyle w:val="TableGrid"/>
         <w:tblW w:w="0" w:type="auto"/>
         <w:tblLook w:val="04A0" w:firstRow="1" w:lastRow="0" w:firstColumn="1" w:lastColumn="0" w:noHBand="0" w:noVBand="1"/>
       </w:tblPr>
@@ -401,18 +399,8 @@
                 <w:w w:val="80"/>
                 <w:lang w:val="es-MX"/>
               </w:rPr>
-              <w:t xml:space="preserve">0% </w:t>
-            </w:r>
-            <w:proofErr w:type="spellStart"/>
-            <w:r>
-              <w:rPr>
-                <w:rFonts w:cstheme="minorHAnsi"/>
-                <w:w w:val="80"/>
-                <w:lang w:val="es-MX"/>
-              </w:rPr>
-              <w:t>Cyan</w:t>
-            </w:r>
-            <w:proofErr w:type="spellEnd"/>
+              <w:t>0% Cyan</w:t>
+            </w:r>
           </w:p>
           <w:p>
             <w:pPr>
@@ -484,18 +472,8 @@
                 <w:w w:val="80"/>
                 <w:lang w:val="es-MX"/>
               </w:rPr>
-              <w:t xml:space="preserve">100% </w:t>
-            </w:r>
-            <w:proofErr w:type="spellStart"/>
-            <w:r>
-              <w:rPr>
-                <w:rFonts w:cstheme="minorHAnsi"/>
-                <w:w w:val="80"/>
-                <w:lang w:val="es-MX"/>
-              </w:rPr>
-              <w:t>Cyan</w:t>
-            </w:r>
-            <w:proofErr w:type="spellEnd"/>
+              <w:t>100% Cyan</w:t>
+            </w:r>
           </w:p>
           <w:p>
             <w:pPr>
@@ -603,7 +581,7 @@
     </w:p>
     <w:tbl>
       <w:tblPr>
-        <w:tblStyle w:val="Tablaconcuadrcula"/>
+        <w:tblStyle w:val="TableGrid"/>
         <w:tblW w:w="0" w:type="auto"/>
         <w:tblLook w:val="04A0" w:firstRow="1" w:lastRow="0" w:firstColumn="1" w:lastColumn="0" w:noHBand="0" w:noVBand="1"/>
       </w:tblPr>
@@ -965,6 +943,146 @@
           </w:p>
         </w:tc>
       </w:tr>
+      <w:tr>
+        <w:tc>
+          <w:tcPr>
+            <w:tcW w:w="1158" w:type="dxa"/>
+          </w:tcPr>
+          <w:p>
+            <w:pPr>
+              <w:rPr>
+                <w:rFonts w:cstheme="minorHAnsi"/>
+                <w:w w:val="80"/>
+                <w:lang w:val="es-MX"/>
+              </w:rPr>
+            </w:pPr>
+            <w:r>
+              <w:rPr>
+                <w:rFonts w:cstheme="minorHAnsi"/>
+                <w:w w:val="80"/>
+                <w:lang w:val="es-MX"/>
+              </w:rPr>
+              <w:t>Word equivalente</w:t>
+            </w:r>
+            <w:r>
+              <w:rPr>
+                <w:rStyle w:val="FootnoteReference"/>
+                <w:rFonts w:cstheme="minorHAnsi"/>
+                <w:w w:val="80"/>
+                <w:lang w:val="es-MX"/>
+              </w:rPr>
+              <w:footnoteReference w:id="1"/>
+            </w:r>
+          </w:p>
+        </w:tc>
+        <w:tc>
+          <w:tcPr>
+            <w:tcW w:w="1096" w:type="dxa"/>
+          </w:tcPr>
+          <w:p>
+            <w:pPr>
+              <w:rPr>
+                <w:rFonts w:cstheme="minorHAnsi"/>
+                <w:w w:val="80"/>
+                <w:lang w:val="es-MX"/>
+              </w:rPr>
+            </w:pPr>
+          </w:p>
+        </w:tc>
+        <w:tc>
+          <w:tcPr>
+            <w:tcW w:w="1095" w:type="dxa"/>
+          </w:tcPr>
+          <w:p>
+            <w:pPr>
+              <w:rPr>
+                <w:rFonts w:cstheme="minorHAnsi"/>
+                <w:w w:val="80"/>
+                <w:lang w:val="es-MX"/>
+              </w:rPr>
+            </w:pPr>
+          </w:p>
+        </w:tc>
+        <w:tc>
+          <w:tcPr>
+            <w:tcW w:w="1095" w:type="dxa"/>
+          </w:tcPr>
+          <w:p>
+            <w:pPr>
+              <w:rPr>
+                <w:rFonts w:cstheme="minorHAnsi"/>
+                <w:w w:val="80"/>
+                <w:lang w:val="es-MX"/>
+              </w:rPr>
+            </w:pPr>
+          </w:p>
+        </w:tc>
+        <w:tc>
+          <w:tcPr>
+            <w:tcW w:w="1096" w:type="dxa"/>
+          </w:tcPr>
+          <w:p>
+            <w:pPr>
+              <w:rPr>
+                <w:rFonts w:cstheme="minorHAnsi"/>
+                <w:w w:val="80"/>
+                <w:lang w:val="es-MX"/>
+              </w:rPr>
+            </w:pPr>
+          </w:p>
+        </w:tc>
+        <w:tc>
+          <w:tcPr>
+            <w:tcW w:w="1096" w:type="dxa"/>
+          </w:tcPr>
+          <w:p>
+            <w:pPr>
+              <w:rPr>
+                <w:rFonts w:cstheme="minorHAnsi"/>
+                <w:w w:val="80"/>
+                <w:lang w:val="es-MX"/>
+              </w:rPr>
+            </w:pPr>
+            <w:r>
+              <w:rPr>
+                <w:rFonts w:cstheme="minorHAnsi"/>
+                <w:b/>
+                <w:bCs/>
+                <w:w w:val="80"/>
+              </w:rPr>
+              <w:t>#003C71 Color</w:t>
+            </w:r>
+          </w:p>
+        </w:tc>
+        <w:tc>
+          <w:tcPr>
+            <w:tcW w:w="1096" w:type="dxa"/>
+          </w:tcPr>
+          <w:p>
+            <w:pPr>
+              <w:rPr>
+                <w:rFonts w:cstheme="minorHAnsi"/>
+                <w:w w:val="80"/>
+                <w:lang w:val="es-MX"/>
+              </w:rPr>
+            </w:pPr>
+          </w:p>
+        </w:tc>
+        <w:tc>
+          <w:tcPr>
+            <w:tcW w:w="1096" w:type="dxa"/>
+          </w:tcPr>
+          <w:p>
+            <w:pPr>
+              <w:rPr>
+                <w:rFonts w:cstheme="minorHAnsi"/>
+                <w:w w:val="80"/>
+                <w:lang w:val="es-MX"/>
+              </w:rPr>
+            </w:pPr>
+          </w:p>
+        </w:tc>
+      </w:tr>
     </w:tbl>
     <w:p/>
     <w:p>
@@ -995,19 +1113,20 @@
     </w:p>
     <w:p>
       <w:pPr>
-        <w:pStyle w:val="Prrafodelista"/>
+        <w:pStyle w:val="ListParagraph"/>
         <w:numPr>
           <w:ilvl w:val="0"/>
           <w:numId w:val="1"/>
         </w:numPr>
       </w:pPr>
       <w:r>
+        <w:lastRenderedPageBreak/>
         <w:t>Cuando el fondo es blanco se utiliza el logo de colores</w:t>
       </w:r>
     </w:p>
     <w:p>
       <w:pPr>
-        <w:pStyle w:val="Prrafodelista"/>
+        <w:pStyle w:val="ListParagraph"/>
         <w:numPr>
           <w:ilvl w:val="0"/>
           <w:numId w:val="1"/>
@@ -1021,7 +1140,6 @@
     <w:p>
       <w:proofErr w:type="spellStart"/>
       <w:r>
-        <w:lastRenderedPageBreak/>
         <w:t>Ej</w:t>
       </w:r>
       <w:proofErr w:type="spellEnd"/>
@@ -1050,7 +1168,7 @@
                     <pic:cNvPicPr/>
                   </pic:nvPicPr>
                   <pic:blipFill>
-                    <a:blip r:embed="rId5" cstate="print">
+                    <a:blip r:embed="rId8" cstate="print">
                       <a:extLst>
                         <a:ext uri="{28A0092B-C50C-407E-A947-70E740481C1C}">
                           <a14:useLocalDpi xmlns:a14="http://schemas.microsoft.com/office/drawing/2010/main" val="0"/>
@@ -1090,7 +1208,7 @@
     </w:p>
     <w:p>
       <w:pPr>
-        <w:pStyle w:val="Prrafodelista"/>
+        <w:pStyle w:val="ListParagraph"/>
         <w:numPr>
           <w:ilvl w:val="0"/>
           <w:numId w:val="1"/>
@@ -1111,7 +1229,7 @@
     </w:p>
     <w:p>
       <w:pPr>
-        <w:pStyle w:val="Prrafodelista"/>
+        <w:pStyle w:val="ListParagraph"/>
         <w:numPr>
           <w:ilvl w:val="0"/>
           <w:numId w:val="1"/>
@@ -1140,7 +1258,7 @@
     </w:p>
     <w:p>
       <w:pPr>
-        <w:pStyle w:val="Prrafodelista"/>
+        <w:pStyle w:val="ListParagraph"/>
         <w:numPr>
           <w:ilvl w:val="0"/>
           <w:numId w:val="1"/>
@@ -1170,7 +1288,7 @@
     </w:p>
     <w:p>
       <w:pPr>
-        <w:pStyle w:val="Prrafodelista"/>
+        <w:pStyle w:val="ListParagraph"/>
         <w:numPr>
           <w:ilvl w:val="0"/>
           <w:numId w:val="1"/>
@@ -1188,7 +1306,7 @@
     </w:p>
     <w:p>
       <w:pPr>
-        <w:pStyle w:val="Prrafodelista"/>
+        <w:pStyle w:val="ListParagraph"/>
       </w:pPr>
     </w:p>
     <w:p>
@@ -1264,8 +1382,83 @@
 </w:document>
 </file>
 
+<file path=word/endnotes.xml><?xml version="1.0" encoding="utf-8"?>
+<w:endnotes xmlns:wpc="http://schemas.microsoft.com/office/word/2010/wordprocessingCanvas" xmlns:cx="http://schemas.microsoft.com/office/drawing/2014/chartex" xmlns:cx1="http://schemas.microsoft.com/office/drawing/2015/9/8/chartex" xmlns:cx2="http://schemas.microsoft.com/office/drawing/2015/10/21/chartex" xmlns:cx3="http://schemas.microsoft.com/office/drawing/2016/5/9/chartex" xmlns:cx4="http://schemas.microsoft.com/office/drawing/2016/5/10/chartex" xmlns:cx5="http://schemas.microsoft.com/office/drawing/2016/5/11/chartex" xmlns:cx6="http://schemas.microsoft.com/office/drawing/2016/5/12/chartex" xmlns:cx7="http://schemas.microsoft.com/office/drawing/2016/5/13/chartex" xmlns:cx8="http://schemas.microsoft.com/office/drawing/2016/5/14/chartex" xmlns:mc="http://schemas.openxmlformats.org/markup-compatibility/2006" xmlns:aink="http://schemas.microsoft.com/office/drawing/2016/ink" xmlns:am3d="http://schemas.microsoft.com/office/drawing/2017/model3d" xmlns:o="urn:schemas-microsoft-com:office:office" xmlns:oel="http://schemas.microsoft.com/office/2019/extlst" xmlns:r="http://schemas.openxmlformats.org/officeDocument/2006/relationships" xmlns:m="http://schemas.openxmlformats.org/officeDocument/2006/math" xmlns:v="urn:schemas-microsoft-com:vml" xmlns:wp14="http://schemas.microsoft.com/office/word/2010/wordprocessingDrawing" xmlns:wp="http://schemas.openxmlformats.org/drawingml/2006/wordprocessingDrawing" xmlns:w10="urn:schemas-microsoft-com:office:word" xmlns:w="http://schemas.openxmlformats.org/wordprocessingml/2006/main" xmlns:w14="http://schemas.microsoft.com/office/word/2010/wordml" xmlns:w15="http://schemas.microsoft.com/office/word/2012/wordml" xmlns:w16cex="http://schemas.microsoft.com/office/word/2018/wordml/cex" xmlns:w16cid="http://schemas.microsoft.com/office/word/2016/wordml/cid" xmlns:w16="http://schemas.microsoft.com/office/word/2018/wordml" xmlns:w16du="http://schemas.microsoft.com/office/word/2023/wordml/word16du" xmlns:w16sdtdh="http://schemas.microsoft.com/office/word/2020/wordml/sdtdatahash" xmlns:w16sdtfl="http://schemas.microsoft.com/office/word/2024/wordml/sdtformatlock" xmlns:w16se="http://schemas.microsoft.com/office/word/2015/wordml/symex" xmlns:wpg="http://schemas.microsoft.com/office/word/2010/wordprocessingGroup" xmlns:wpi="http://schemas.microsoft.com/office/word/2010/wordprocessingInk" xmlns:wne="http://schemas.microsoft.com/office/word/2006/wordml" xmlns:wps="http://schemas.microsoft.com/office/word/2010/wordprocessingShape" mc:Ignorable="w14 w15 w16se w16cid w16 w16cex w16sdtdh w16sdtfl w16du wp14">
+  <w:endnote w:type="separator" w:id="-1">
+    <w:p>
+      <w:pPr>
+        <w:spacing w:after="0" w:line="240" w:lineRule="auto"/>
+      </w:pPr>
+      <w:r>
+        <w:separator/>
+      </w:r>
+    </w:p>
+  </w:endnote>
+  <w:endnote w:type="continuationSeparator" w:id="0">
+    <w:p>
+      <w:pPr>
+        <w:spacing w:after="0" w:line="240" w:lineRule="auto"/>
+      </w:pPr>
+      <w:r>
+        <w:continuationSeparator/>
+      </w:r>
+    </w:p>
+  </w:endnote>
+</w:endnotes>
+</file>
+
+<file path=word/footnotes.xml><?xml version="1.0" encoding="utf-8"?>
+<w:footnotes xmlns:wpc="http://schemas.microsoft.com/office/word/2010/wordprocessingCanvas" xmlns:cx="http://schemas.microsoft.com/office/drawing/2014/chartex" xmlns:cx1="http://schemas.microsoft.com/office/drawing/2015/9/8/chartex" xmlns:cx2="http://schemas.microsoft.com/office/drawing/2015/10/21/chartex" xmlns:cx3="http://schemas.microsoft.com/office/drawing/2016/5/9/chartex" xmlns:cx4="http://schemas.microsoft.com/office/drawing/2016/5/10/chartex" xmlns:cx5="http://schemas.microsoft.com/office/drawing/2016/5/11/chartex" xmlns:cx6="http://schemas.microsoft.com/office/drawing/2016/5/12/chartex" xmlns:cx7="http://schemas.microsoft.com/office/drawing/2016/5/13/chartex" xmlns:cx8="http://schemas.microsoft.com/office/drawing/2016/5/14/chartex" xmlns:mc="http://schemas.openxmlformats.org/markup-compatibility/2006" xmlns:aink="http://schemas.microsoft.com/office/drawing/2016/ink" xmlns:am3d="http://schemas.microsoft.com/office/drawing/2017/model3d" xmlns:o="urn:schemas-microsoft-com:office:office" xmlns:oel="http://schemas.microsoft.com/office/2019/extlst" xmlns:r="http://schemas.openxmlformats.org/officeDocument/2006/relationships" xmlns:m="http://schemas.openxmlformats.org/officeDocument/2006/math" xmlns:v="urn:schemas-microsoft-com:vml" xmlns:wp14="http://schemas.microsoft.com/office/word/2010/wordprocessingDrawing" xmlns:wp="http://schemas.openxmlformats.org/drawingml/2006/wordprocessingDrawing" xmlns:w10="urn:schemas-microsoft-com:office:word" xmlns:w="http://schemas.openxmlformats.org/wordprocessingml/2006/main" xmlns:w14="http://schemas.microsoft.com/office/word/2010/wordml" xmlns:w15="http://schemas.microsoft.com/office/word/2012/wordml" xmlns:w16cex="http://schemas.microsoft.com/office/word/2018/wordml/cex" xmlns:w16cid="http://schemas.microsoft.com/office/word/2016/wordml/cid" xmlns:w16="http://schemas.microsoft.com/office/word/2018/wordml" xmlns:w16du="http://schemas.microsoft.com/office/word/2023/wordml/word16du" xmlns:w16sdtdh="http://schemas.microsoft.com/office/word/2020/wordml/sdtdatahash" xmlns:w16sdtfl="http://schemas.microsoft.com/office/word/2024/wordml/sdtformatlock" xmlns:w16se="http://schemas.microsoft.com/office/word/2015/wordml/symex" xmlns:wpg="http://schemas.microsoft.com/office/word/2010/wordprocessingGroup" xmlns:wpi="http://schemas.microsoft.com/office/word/2010/wordprocessingInk" xmlns:wne="http://schemas.microsoft.com/office/word/2006/wordml" xmlns:wps="http://schemas.microsoft.com/office/word/2010/wordprocessingShape" mc:Ignorable="w14 w15 w16se w16cid w16 w16cex w16sdtdh w16sdtfl w16du wp14">
+  <w:footnote w:type="separator" w:id="-1">
+    <w:p>
+      <w:pPr>
+        <w:spacing w:after="0" w:line="240" w:lineRule="auto"/>
+      </w:pPr>
+      <w:r>
+        <w:separator/>
+      </w:r>
+    </w:p>
+  </w:footnote>
+  <w:footnote w:type="continuationSeparator" w:id="0">
+    <w:p>
+      <w:pPr>
+        <w:spacing w:after="0" w:line="240" w:lineRule="auto"/>
+      </w:pPr>
+      <w:r>
+        <w:continuationSeparator/>
+      </w:r>
+    </w:p>
+  </w:footnote>
+  <w:footnote w:id="1">
+    <w:p>
+      <w:pPr>
+        <w:pStyle w:val="FootnoteText"/>
+      </w:pPr>
+      <w:r>
+        <w:rPr>
+          <w:rStyle w:val="FootnoteReference"/>
+        </w:rPr>
+        <w:footnoteRef/>
+      </w:r>
+      <w:r>
+        <w:t xml:space="preserve"> Fuente: </w:t>
+      </w:r>
+      <w:r>
+        <w:t>https://icolorpalette.com/color/003C71/</w:t>
+      </w:r>
+      <w:r>
+        <w:t xml:space="preserve"> re</w:t>
+      </w:r>
+      <w:r>
+        <w:t>visado 22 de abril de 2026.</w:t>
+      </w:r>
+    </w:p>
+  </w:footnote>
+</w:footnotes>
+</file>
+
 <file path=word/numbering.xml><?xml version="1.0" encoding="utf-8"?>
-<w:numbering xmlns:wpc="http://schemas.microsoft.com/office/word/2010/wordprocessingCanvas" xmlns:cx="http://schemas.microsoft.com/office/drawing/2014/chartex" xmlns:cx1="http://schemas.microsoft.com/office/drawing/2015/9/8/chartex" xmlns:cx2="http://schemas.microsoft.com/office/drawing/2015/10/21/chartex" xmlns:cx3="http://schemas.microsoft.com/office/drawing/2016/5/9/chartex" xmlns:cx4="http://schemas.microsoft.com/office/drawing/2016/5/10/chartex" xmlns:cx5="http://schemas.microsoft.com/office/drawing/2016/5/11/chartex" xmlns:cx6="http://schemas.microsoft.com/office/drawing/2016/5/12/chartex" xmlns:cx7="http://schemas.microsoft.com/office/drawing/2016/5/13/chartex" xmlns:cx8="http://schemas.microsoft.com/office/drawing/2016/5/14/chartex" xmlns:mc="http://schemas.openxmlformats.org/markup-compatibility/2006" xmlns:aink="http://schemas.microsoft.com/office/drawing/2016/ink" xmlns:am3d="http://schemas.microsoft.com/office/drawing/2017/model3d" xmlns:o="urn:schemas-microsoft-com:office:office" xmlns:oel="http://schemas.microsoft.com/office/2019/extlst" xmlns:r="http://schemas.openxmlformats.org/officeDocument/2006/relationships" xmlns:m="http://schemas.openxmlformats.org/officeDocument/2006/math" xmlns:v="urn:schemas-microsoft-com:vml" xmlns:wp14="http://schemas.microsoft.com/office/word/2010/wordprocessingDrawing" xmlns:wp="http://schemas.openxmlformats.org/drawingml/2006/wordprocessingDrawing" xmlns:w10="urn:schemas-microsoft-com:office:word" xmlns:w="http://schemas.openxmlformats.org/wordprocessingml/2006/main" xmlns:w14="http://schemas.microsoft.com/office/word/2010/wordml" xmlns:w15="http://schemas.microsoft.com/office/word/2012/wordml" xmlns:w16cex="http://schemas.microsoft.com/office/word/2018/wordml/cex" xmlns:w16cid="http://schemas.microsoft.com/office/word/2016/wordml/cid" xmlns:w16="http://schemas.microsoft.com/office/word/2018/wordml" xmlns:w16sdtdh="http://schemas.microsoft.com/office/word/2020/wordml/sdtdatahash" xmlns:w16se="http://schemas.microsoft.com/office/word/2015/wordml/symex" xmlns:wpg="http://schemas.microsoft.com/office/word/2010/wordprocessingGroup" xmlns:wpi="http://schemas.microsoft.com/office/word/2010/wordprocessingInk" xmlns:wne="http://schemas.microsoft.com/office/word/2006/wordml" xmlns:wps="http://schemas.microsoft.com/office/word/2010/wordprocessingShape" mc:Ignorable="w14 w15 w16se w16cid w16 w16cex w16sdtdh wp14">
+<w:numbering xmlns:wpc="http://schemas.microsoft.com/office/word/2010/wordprocessingCanvas" xmlns:cx="http://schemas.microsoft.com/office/drawing/2014/chartex" xmlns:cx1="http://schemas.microsoft.com/office/drawing/2015/9/8/chartex" xmlns:cx2="http://schemas.microsoft.com/office/drawing/2015/10/21/chartex" xmlns:cx3="http://schemas.microsoft.com/office/drawing/2016/5/9/chartex" xmlns:cx4="http://schemas.microsoft.com/office/drawing/2016/5/10/chartex" xmlns:cx5="http://schemas.microsoft.com/office/drawing/2016/5/11/chartex" xmlns:cx6="http://schemas.microsoft.com/office/drawing/2016/5/12/chartex" xmlns:cx7="http://schemas.microsoft.com/office/drawing/2016/5/13/chartex" xmlns:cx8="http://schemas.microsoft.com/office/drawing/2016/5/14/chartex" xmlns:mc="http://schemas.openxmlformats.org/markup-compatibility/2006" xmlns:aink="http://schemas.microsoft.com/office/drawing/2016/ink" xmlns:am3d="http://schemas.microsoft.com/office/drawing/2017/model3d" xmlns:o="urn:schemas-microsoft-com:office:office" xmlns:oel="http://schemas.microsoft.com/office/2019/extlst" xmlns:r="http://schemas.openxmlformats.org/officeDocument/2006/relationships" xmlns:m="http://schemas.openxmlformats.org/officeDocument/2006/math" xmlns:v="urn:schemas-microsoft-com:vml" xmlns:wp14="http://schemas.microsoft.com/office/word/2010/wordprocessingDrawing" xmlns:wp="http://schemas.openxmlformats.org/drawingml/2006/wordprocessingDrawing" xmlns:w10="urn:schemas-microsoft-com:office:word" xmlns:w="http://schemas.openxmlformats.org/wordprocessingml/2006/main" xmlns:w14="http://schemas.microsoft.com/office/word/2010/wordml" xmlns:w15="http://schemas.microsoft.com/office/word/2012/wordml" xmlns:w16cex="http://schemas.microsoft.com/office/word/2018/wordml/cex" xmlns:w16cid="http://schemas.microsoft.com/office/word/2016/wordml/cid" xmlns:w16="http://schemas.microsoft.com/office/word/2018/wordml" xmlns:w16du="http://schemas.microsoft.com/office/word/2023/wordml/word16du" xmlns:w16sdtdh="http://schemas.microsoft.com/office/word/2020/wordml/sdtdatahash" xmlns:w16sdtfl="http://schemas.microsoft.com/office/word/2024/wordml/sdtformatlock" xmlns:w16se="http://schemas.microsoft.com/office/word/2015/wordml/symex" xmlns:wpg="http://schemas.microsoft.com/office/word/2010/wordprocessingGroup" xmlns:wpi="http://schemas.microsoft.com/office/word/2010/wordprocessingInk" xmlns:wne="http://schemas.microsoft.com/office/word/2006/wordml" xmlns:wps="http://schemas.microsoft.com/office/word/2010/wordprocessingShape" mc:Ignorable="w14 w15 w16se w16cid w16 w16cex w16sdtdh w16sdtfl w16du wp14">
   <w:abstractNum w:abstractNumId="0" w15:restartNumberingAfterBreak="0">
     <w:nsid w:val="55EC7F62"/>
     <w:multiLevelType w:val="hybridMultilevel"/>
@@ -1386,7 +1579,7 @@
 </file>
 
 <file path=word/styles.xml><?xml version="1.0" encoding="utf-8"?>
-<w:styles xmlns:mc="http://schemas.openxmlformats.org/markup-compatibility/2006" xmlns:r="http://schemas.openxmlformats.org/officeDocument/2006/relationships" xmlns:w="http://schemas.openxmlformats.org/wordprocessingml/2006/main" xmlns:w14="http://schemas.microsoft.com/office/word/2010/wordml" xmlns:w15="http://schemas.microsoft.com/office/word/2012/wordml" xmlns:w16cex="http://schemas.microsoft.com/office/word/2018/wordml/cex" xmlns:w16cid="http://schemas.microsoft.com/office/word/2016/wordml/cid" xmlns:w16="http://schemas.microsoft.com/office/word/2018/wordml" xmlns:w16sdtdh="http://schemas.microsoft.com/office/word/2020/wordml/sdtdatahash" xmlns:w16se="http://schemas.microsoft.com/office/word/2015/wordml/symex" mc:Ignorable="w14 w15 w16se w16cid w16 w16cex w16sdtdh">
+<w:styles xmlns:mc="http://schemas.openxmlformats.org/markup-compatibility/2006" xmlns:r="http://schemas.openxmlformats.org/officeDocument/2006/relationships" xmlns:w="http://schemas.openxmlformats.org/wordprocessingml/2006/main" xmlns:w14="http://schemas.microsoft.com/office/word/2010/wordml" xmlns:w15="http://schemas.microsoft.com/office/word/2012/wordml" xmlns:w16cex="http://schemas.microsoft.com/office/word/2018/wordml/cex" xmlns:w16cid="http://schemas.microsoft.com/office/word/2016/wordml/cid" xmlns:w16="http://schemas.microsoft.com/office/word/2018/wordml" xmlns:w16du="http://schemas.microsoft.com/office/word/2023/wordml/word16du" xmlns:w16sdtdh="http://schemas.microsoft.com/office/word/2020/wordml/sdtdatahash" xmlns:w16sdtfl="http://schemas.microsoft.com/office/word/2024/wordml/sdtformatlock" xmlns:w16se="http://schemas.microsoft.com/office/word/2015/wordml/symex" mc:Ignorable="w14 w15 w16se w16cid w16 w16cex w16sdtdh w16sdtfl w16du">
   <w:docDefaults>
     <w:rPrDefault>
       <w:rPr>
@@ -1786,13 +1979,12 @@
     <w:name w:val="Normal"/>
     <w:qFormat/>
   </w:style>
-  <w:style w:type="character" w:default="1" w:styleId="Fuentedeprrafopredeter">
+  <w:style w:type="character" w:default="1" w:styleId="DefaultParagraphFont">
     <w:name w:val="Default Paragraph Font"/>
     <w:uiPriority w:val="1"/>
-    <w:semiHidden/>
     <w:unhideWhenUsed/>
   </w:style>
-  <w:style w:type="table" w:default="1" w:styleId="Tablanormal">
+  <w:style w:type="table" w:default="1" w:styleId="TableNormal">
     <w:name w:val="Normal Table"/>
     <w:uiPriority w:val="99"/>
     <w:semiHidden/>
@@ -1807,15 +1999,15 @@
       </w:tblCellMar>
     </w:tblPr>
   </w:style>
-  <w:style w:type="numbering" w:default="1" w:styleId="Sinlista">
+  <w:style w:type="numbering" w:default="1" w:styleId="NoList">
     <w:name w:val="No List"/>
     <w:uiPriority w:val="99"/>
     <w:semiHidden/>
     <w:unhideWhenUsed/>
   </w:style>
-  <w:style w:type="table" w:styleId="Tablaconcuadrcula">
+  <w:style w:type="table" w:styleId="TableGrid">
     <w:name w:val="Table Grid"/>
-    <w:basedOn w:val="Tablanormal"/>
+    <w:basedOn w:val="TableNormal"/>
     <w:uiPriority w:val="39"/>
     <w:rsid w:val="00B527BC"/>
     <w:pPr>
@@ -1832,7 +2024,7 @@
       </w:tblBorders>
     </w:tblPr>
   </w:style>
-  <w:style w:type="paragraph" w:styleId="Prrafodelista">
+  <w:style w:type="paragraph" w:styleId="ListParagraph">
     <w:name w:val="List Paragraph"/>
     <w:basedOn w:val="Normal"/>
     <w:uiPriority w:val="34"/>
@@ -1842,6 +2034,45 @@
       <w:ind w:left="720"/>
       <w:contextualSpacing/>
     </w:pPr>
+  </w:style>
+  <w:style w:type="paragraph" w:styleId="FootnoteText">
+    <w:name w:val="footnote text"/>
+    <w:basedOn w:val="Normal"/>
+    <w:link w:val="FootnoteTextChar"/>
+    <w:uiPriority w:val="99"/>
+    <w:semiHidden/>
+    <w:unhideWhenUsed/>
+    <w:rsid w:val="002E43B1"/>
+    <w:pPr>
+      <w:spacing w:after="0" w:line="240" w:lineRule="auto"/>
+    </w:pPr>
+    <w:rPr>
+      <w:sz w:val="20"/>
+      <w:szCs w:val="20"/>
+    </w:rPr>
+  </w:style>
+  <w:style w:type="character" w:customStyle="1" w:styleId="FootnoteTextChar">
+    <w:name w:val="Footnote Text Char"/>
+    <w:basedOn w:val="DefaultParagraphFont"/>
+    <w:link w:val="FootnoteText"/>
+    <w:uiPriority w:val="99"/>
+    <w:semiHidden/>
+    <w:rsid w:val="002E43B1"/>
+    <w:rPr>
+      <w:sz w:val="20"/>
+      <w:szCs w:val="20"/>
+    </w:rPr>
+  </w:style>
+  <w:style w:type="character" w:styleId="FootnoteReference">
+    <w:name w:val="footnote reference"/>
+    <w:basedOn w:val="DefaultParagraphFont"/>
+    <w:uiPriority w:val="99"/>
+    <w:semiHidden/>
+    <w:unhideWhenUsed/>
+    <w:rsid w:val="002E43B1"/>
+    <w:rPr>
+      <w:vertAlign w:val="superscript"/>
+    </w:rPr>
   </w:style>
 </w:styles>
 </file>
@@ -2139,4 +2370,16 @@
     </a:ext>
   </a:extLst>
 </a:theme>
+</file>
+
+<file path=customXml/item1.xml><?xml version="1.0" encoding="utf-8"?>
+<b:Sources xmlns:b="http://schemas.openxmlformats.org/officeDocument/2006/bibliography" xmlns="http://schemas.openxmlformats.org/officeDocument/2006/bibliography" SelectedStyle="\APASixthEditionOfficeOnline.xsl" StyleName="APA" Version="6"/>
+</file>
+
+<file path=customXml/itemProps1.xml><?xml version="1.0" encoding="utf-8"?>
+<ds:datastoreItem xmlns:ds="http://schemas.openxmlformats.org/officeDocument/2006/customXml" ds:itemID="{7B8DAA7F-3978-4F2C-A31A-5CFCD8853C49}">
+  <ds:schemaRefs>
+    <ds:schemaRef ds:uri="http://schemas.openxmlformats.org/officeDocument/2006/bibliography"/>
+  </ds:schemaRefs>
+</ds:datastoreItem>
 </file>
</xml_diff>